<commit_message>
Implemented May 4 2026 feedback
</commit_message>
<xml_diff>
--- a/docassemble/MinorGuardianshipDischarge/data/templates/guardianship_discharge_instructions.docx
+++ b/docassemble/MinorGuardianshipDischarge/data/templates/guardianship_discharge_instructions.docx
@@ -21,7 +21,7 @@
             <w:tcBorders>
               <w:top w:val="nil"/>
               <w:left w:val="nil"/>
-              <w:bottom w:val="single" w:sz="4" w:space="0" w:color="auto"/>
+              <w:bottom w:val="nil"/>
               <w:right w:val="nil"/>
             </w:tcBorders>
           </w:tcPr>
@@ -39,17 +39,17 @@
                 <w:szCs w:val="32"/>
               </w:rPr>
               <w:drawing>
-                <wp:anchor distT="0" distB="0" distL="114300" distR="114300" simplePos="0" relativeHeight="251659264" behindDoc="0" locked="0" layoutInCell="1" allowOverlap="1" wp14:anchorId="2604088D" wp14:editId="03C8CA6A">
+                <wp:anchor distT="0" distB="0" distL="114300" distR="114300" simplePos="0" relativeHeight="251659264" behindDoc="1" locked="0" layoutInCell="1" allowOverlap="1" wp14:anchorId="2604088D" wp14:editId="21EEB476">
                   <wp:simplePos x="0" y="0"/>
                   <wp:positionH relativeFrom="column">
-                    <wp:posOffset>2540</wp:posOffset>
+                    <wp:posOffset>5646420</wp:posOffset>
                   </wp:positionH>
                   <wp:positionV relativeFrom="paragraph">
-                    <wp:posOffset>12700</wp:posOffset>
+                    <wp:posOffset>0</wp:posOffset>
                   </wp:positionV>
                   <wp:extent cx="1143000" cy="640715"/>
                   <wp:effectExtent l="0" t="0" r="0" b="6985"/>
-                  <wp:wrapSquare wrapText="bothSides"/>
+                  <wp:wrapNone/>
                   <wp:docPr id="2" name="Picture 2"/>
                   <wp:cNvGraphicFramePr>
                     <a:graphicFrameLocks xmlns:a="http://schemas.openxmlformats.org/drawingml/2006/main" noChangeAspect="1"/>
@@ -85,6 +85,9 @@
                       </pic:pic>
                     </a:graphicData>
                   </a:graphic>
+                  <wp14:sizeRelH relativeFrom="margin">
+                    <wp14:pctWidth>0</wp14:pctWidth>
+                  </wp14:sizeRelH>
                   <wp14:sizeRelV relativeFrom="margin">
                     <wp14:pctHeight>0</wp14:pctHeight>
                   </wp14:sizeRelV>
@@ -110,17 +113,38 @@
                 <w:sz w:val="32"/>
                 <w:szCs w:val="32"/>
               </w:rPr>
-              <w:t xml:space="preserve">How to </w:t>
-            </w:r>
-            <w:r>
+              <w:t>End guardianship of a child</w:t>
+            </w:r>
+          </w:p>
+          <w:p>
+            <w:pPr>
               <w:rPr>
                 <w:rFonts w:ascii="Arial" w:hAnsi="Arial" w:cs="Arial"/>
                 <w:b/>
                 <w:bCs/>
-                <w:sz w:val="32"/>
-                <w:szCs w:val="32"/>
-              </w:rPr>
-              <w:t>file your Petition to Discharge Guardianship</w:t>
+                <w:sz w:val="4"/>
+                <w:szCs w:val="4"/>
+              </w:rPr>
+            </w:pPr>
+          </w:p>
+          <w:p>
+            <w:pPr>
+              <w:pBdr>
+                <w:bottom w:val="single" w:sz="12" w:space="1" w:color="auto"/>
+              </w:pBdr>
+              <w:rPr>
+                <w:rFonts w:ascii="Muli" w:hAnsi="Muli"/>
+                <w:sz w:val="28"/>
+                <w:szCs w:val="28"/>
+              </w:rPr>
+            </w:pPr>
+            <w:r>
+              <w:rPr>
+                <w:rFonts w:ascii="Muli" w:hAnsi="Muli"/>
+                <w:sz w:val="28"/>
+                <w:szCs w:val="28"/>
+              </w:rPr>
+              <w:t>Instructions</w:t>
             </w:r>
           </w:p>
         </w:tc>
@@ -130,9 +154,9 @@
           <w:tcPr>
             <w:tcW w:w="10800" w:type="dxa"/>
             <w:tcBorders>
-              <w:top w:val="single" w:sz="4" w:space="0" w:color="auto"/>
+              <w:top w:val="nil"/>
               <w:left w:val="nil"/>
-              <w:bottom w:val="single" w:sz="4" w:space="0" w:color="auto"/>
+              <w:bottom w:val="nil"/>
               <w:right w:val="nil"/>
             </w:tcBorders>
           </w:tcPr>
@@ -1005,14 +1029,7 @@
                 <w:sz w:val="24"/>
                 <w:szCs w:val="24"/>
               </w:rPr>
-              <w:t xml:space="preserve">to everyone who is getting </w:t>
-            </w:r>
-            <w:r>
-              <w:rPr>
-                <w:sz w:val="24"/>
-                <w:szCs w:val="24"/>
-              </w:rPr>
-              <w:t>Notice of Court Date and Proof of Delivery forms</w:t>
+              <w:t>to everyone who is getting Notice of Court Date and Proof of Delivery forms</w:t>
             </w:r>
             <w:r>
               <w:rPr>
@@ -1036,14 +1053,7 @@
                 <w:sz w:val="24"/>
                 <w:szCs w:val="24"/>
               </w:rPr>
-              <w:t>You will also need one copy for yourself, and one for the judg</w:t>
-            </w:r>
-            <w:r>
-              <w:rPr>
-                <w:sz w:val="24"/>
-                <w:szCs w:val="24"/>
-              </w:rPr>
-              <w:t>e</w:t>
+              <w:t>You will also need one copy for yourself, and one for the judge</w:t>
             </w:r>
             <w:r>
               <w:rPr>
@@ -1247,15 +1257,7 @@
                   <w:sz w:val="24"/>
                   <w:szCs w:val="24"/>
                 </w:rPr>
-                <w:t>https://www.illinoislegalaid.org/legal-information/filing-court-papers-fre</w:t>
-              </w:r>
-              <w:r>
-                <w:rPr>
-                  <w:rStyle w:val="Hyperlink"/>
-                  <w:sz w:val="24"/>
-                  <w:szCs w:val="24"/>
-                </w:rPr>
-                <w:t>e</w:t>
+                <w:t>https://www.illinoislegalaid.org/legal-information/filing-court-papers-free</w:t>
               </w:r>
             </w:hyperlink>
           </w:p>
@@ -1489,7 +1491,7 @@
           <w:tcPr>
             <w:tcW w:w="10800" w:type="dxa"/>
             <w:tcBorders>
-              <w:top w:val="single" w:sz="4" w:space="0" w:color="auto"/>
+              <w:top w:val="nil"/>
               <w:left w:val="nil"/>
               <w:bottom w:val="nil"/>
               <w:right w:val="nil"/>
@@ -1557,62 +1559,52 @@
       <w:pStyle w:val="Footer"/>
       <w:jc w:val="center"/>
       <w:rPr>
-        <w:rFonts w:ascii="Arial" w:hAnsi="Arial" w:cs="Arial"/>
+        <w:rFonts w:ascii="Muli" w:hAnsi="Muli" w:cs="Arial"/>
         <w:b/>
-        <w:sz w:val="20"/>
-        <w:szCs w:val="20"/>
       </w:rPr>
     </w:pPr>
     <w:r>
       <w:rPr>
-        <w:rFonts w:ascii="Arial" w:hAnsi="Arial" w:cs="Arial"/>
+        <w:rFonts w:ascii="Muli" w:hAnsi="Muli" w:cs="Arial"/>
         <w:b/>
-        <w:sz w:val="20"/>
-        <w:szCs w:val="20"/>
       </w:rPr>
-      <w:t xml:space="preserve">THESE INSTRUCTIONS ARE FOR YOUR PERSONAL USE ONLY. </w:t>
+      <w:t>Do not send these instructions to the court</w:t>
     </w:r>
     <w:r>
       <w:rPr>
-        <w:rFonts w:ascii="Arial" w:hAnsi="Arial" w:cs="Arial"/>
+        <w:rFonts w:ascii="Muli" w:hAnsi="Muli" w:cs="Arial"/>
         <w:b/>
-        <w:sz w:val="20"/>
-        <w:szCs w:val="20"/>
       </w:rPr>
-      <w:t xml:space="preserve">YOU DO NOT NEED TO </w:t>
-    </w:r>
-    <w:r>
-      <w:rPr>
-        <w:rFonts w:ascii="Arial" w:hAnsi="Arial" w:cs="Arial"/>
-        <w:b/>
-        <w:sz w:val="20"/>
-        <w:szCs w:val="20"/>
-      </w:rPr>
-      <w:t>FILE</w:t>
-    </w:r>
-    <w:r>
-      <w:rPr>
-        <w:rFonts w:ascii="Arial" w:hAnsi="Arial" w:cs="Arial"/>
-        <w:b/>
-        <w:sz w:val="20"/>
-        <w:szCs w:val="20"/>
-      </w:rPr>
-      <w:t xml:space="preserve"> THEM.</w:t>
+      <w:t>.</w:t>
     </w:r>
   </w:p>
   <w:p>
     <w:pPr>
       <w:pStyle w:val="Footer"/>
       <w:jc w:val="center"/>
+      <w:rPr>
+        <w:rFonts w:ascii="Muli" w:hAnsi="Muli" w:cs="Arial"/>
+        <w:b/>
+        <w:sz w:val="22"/>
+        <w:szCs w:val="22"/>
+      </w:rPr>
     </w:pPr>
+    <w:r>
+      <w:rPr>
+        <w:rFonts w:ascii="Muli" w:hAnsi="Muli"/>
+        <w:sz w:val="22"/>
+        <w:szCs w:val="22"/>
+      </w:rPr>
+      <w:t xml:space="preserve">Illinois Legal Aid Online   </w:t>
+    </w:r>
     <w:hyperlink r:id="rId1" w:history="1">
       <w:r>
         <w:rPr>
           <w:rStyle w:val="Hyperlink"/>
-          <w:rFonts w:ascii="Arial" w:hAnsi="Arial" w:cs="Arial"/>
+          <w:rFonts w:ascii="Muli" w:hAnsi="Muli" w:cs="Arial"/>
           <w:b/>
-          <w:sz w:val="20"/>
-          <w:szCs w:val="20"/>
+          <w:sz w:val="22"/>
+          <w:szCs w:val="22"/>
         </w:rPr>
         <w:t>www.illinoislegalaid.org</w:t>
       </w:r>

</xml_diff>

<commit_message>
Additional instructions template edits
</commit_message>
<xml_diff>
--- a/docassemble/MinorGuardianshipDischarge/data/templates/guardianship_discharge_instructions.docx
+++ b/docassemble/MinorGuardianshipDischarge/data/templates/guardianship_discharge_instructions.docx
@@ -272,25 +272,7 @@
                 <w:sz w:val="24"/>
                 <w:szCs w:val="24"/>
               </w:rPr>
-              <w:t xml:space="preserve">when you </w:t>
-            </w:r>
-            <w:proofErr w:type="gramStart"/>
-            <w:r>
-              <w:rPr>
-                <w:rFonts w:cs="Arial"/>
-                <w:sz w:val="24"/>
-                <w:szCs w:val="24"/>
-              </w:rPr>
-              <w:t>are able to</w:t>
-            </w:r>
-            <w:proofErr w:type="gramEnd"/>
-            <w:r>
-              <w:rPr>
-                <w:rFonts w:cs="Arial"/>
-                <w:sz w:val="24"/>
-                <w:szCs w:val="24"/>
-              </w:rPr>
-              <w:t xml:space="preserve"> take care of your child and the guardian is no longer needed</w:t>
+              <w:t>when you are able to take care of your child and the guardian is no longer needed</w:t>
             </w:r>
             <w:r>
               <w:rPr>
@@ -375,7 +357,7 @@
           <w:p>
             <w:pPr>
               <w:pStyle w:val="NoSpacing"/>
-              <w:spacing w:line="360" w:lineRule="auto"/>
+              <w:spacing w:after="40" w:line="360" w:lineRule="auto"/>
               <w:rPr>
                 <w:rFonts w:cs="Arial"/>
                 <w:b/>
@@ -399,7 +381,7 @@
                 <w:sz w:val="24"/>
                 <w:szCs w:val="24"/>
               </w:rPr>
-              <w:t>will I need</w:t>
+              <w:t>will I have to do</w:t>
             </w:r>
             <w:r>
               <w:rPr>
@@ -409,279 +391,6 @@
                 <w:szCs w:val="24"/>
               </w:rPr>
               <w:t>?</w:t>
-            </w:r>
-          </w:p>
-          <w:p>
-            <w:pPr>
-              <w:pStyle w:val="NoSpacing"/>
-              <w:numPr>
-                <w:ilvl w:val="0"/>
-                <w:numId w:val="7"/>
-              </w:numPr>
-              <w:spacing w:line="360" w:lineRule="auto"/>
-              <w:rPr>
-                <w:rFonts w:cs="Arial"/>
-                <w:b/>
-                <w:sz w:val="24"/>
-                <w:szCs w:val="24"/>
-              </w:rPr>
-            </w:pPr>
-            <w:r>
-              <w:rPr>
-                <w:rFonts w:cs="Arial"/>
-                <w:b/>
-                <w:sz w:val="24"/>
-                <w:szCs w:val="24"/>
-              </w:rPr>
-              <w:t>Two unsigned copies of your Petition to Discharge Guardianship of a Minor</w:t>
-            </w:r>
-            <w:r>
-              <w:rPr>
-                <w:rFonts w:cs="Arial"/>
-                <w:sz w:val="24"/>
-                <w:szCs w:val="24"/>
-              </w:rPr>
-              <w:t xml:space="preserve">. </w:t>
-            </w:r>
-          </w:p>
-          <w:p>
-            <w:pPr>
-              <w:pStyle w:val="NoSpacing"/>
-              <w:numPr>
-                <w:ilvl w:val="0"/>
-                <w:numId w:val="7"/>
-              </w:numPr>
-              <w:spacing w:line="360" w:lineRule="auto"/>
-              <w:rPr>
-                <w:rFonts w:cs="Arial"/>
-                <w:b/>
-                <w:sz w:val="24"/>
-                <w:szCs w:val="24"/>
-              </w:rPr>
-            </w:pPr>
-            <w:r>
-              <w:rPr>
-                <w:rFonts w:cs="Arial"/>
-                <w:b/>
-                <w:sz w:val="24"/>
-                <w:szCs w:val="24"/>
-              </w:rPr>
-              <w:t>A notary public.</w:t>
-            </w:r>
-            <w:r>
-              <w:rPr>
-                <w:rFonts w:cs="Arial"/>
-                <w:b/>
-                <w:sz w:val="24"/>
-                <w:szCs w:val="24"/>
-              </w:rPr>
-              <w:t xml:space="preserve"> </w:t>
-            </w:r>
-            <w:r>
-              <w:rPr>
-                <w:rFonts w:cs="Arial"/>
-                <w:bCs/>
-                <w:sz w:val="24"/>
-                <w:szCs w:val="24"/>
-              </w:rPr>
-              <w:t xml:space="preserve">A notary is a person </w:t>
-            </w:r>
-            <w:r>
-              <w:rPr>
-                <w:sz w:val="24"/>
-                <w:szCs w:val="24"/>
-              </w:rPr>
-              <w:t xml:space="preserve">licensed to witness people signing documents.  You can usually find a notary at a currency exchange, a check-cashing office, a bank, a law office, or a </w:t>
-            </w:r>
-            <w:proofErr w:type="gramStart"/>
-            <w:r>
-              <w:rPr>
-                <w:sz w:val="24"/>
-                <w:szCs w:val="24"/>
-              </w:rPr>
-              <w:t>court house</w:t>
-            </w:r>
-            <w:proofErr w:type="gramEnd"/>
-            <w:r>
-              <w:rPr>
-                <w:sz w:val="24"/>
-                <w:szCs w:val="24"/>
-              </w:rPr>
-              <w:t>.</w:t>
-            </w:r>
-          </w:p>
-          <w:p>
-            <w:pPr>
-              <w:pStyle w:val="NoSpacing"/>
-              <w:numPr>
-                <w:ilvl w:val="0"/>
-                <w:numId w:val="7"/>
-              </w:numPr>
-              <w:spacing w:line="360" w:lineRule="auto"/>
-              <w:rPr>
-                <w:rFonts w:cs="Arial"/>
-                <w:b/>
-                <w:sz w:val="24"/>
-                <w:szCs w:val="24"/>
-              </w:rPr>
-            </w:pPr>
-            <w:r>
-              <w:rPr>
-                <w:rFonts w:cs="Arial"/>
-                <w:b/>
-                <w:sz w:val="24"/>
-                <w:szCs w:val="24"/>
-              </w:rPr>
-              <w:t>Photo ID.</w:t>
-            </w:r>
-            <w:r>
-              <w:rPr>
-                <w:rFonts w:cs="Arial"/>
-                <w:b/>
-                <w:sz w:val="24"/>
-                <w:szCs w:val="24"/>
-              </w:rPr>
-              <w:t xml:space="preserve"> </w:t>
-            </w:r>
-            <w:r>
-              <w:rPr>
-                <w:sz w:val="24"/>
-                <w:szCs w:val="24"/>
-              </w:rPr>
-              <w:t xml:space="preserve">You </w:t>
-            </w:r>
-            <w:r>
-              <w:rPr>
-                <w:sz w:val="24"/>
-                <w:szCs w:val="24"/>
-              </w:rPr>
-              <w:t>will need to</w:t>
-            </w:r>
-            <w:r>
-              <w:rPr>
-                <w:sz w:val="24"/>
-                <w:szCs w:val="24"/>
-              </w:rPr>
-              <w:t xml:space="preserve"> show the </w:t>
-            </w:r>
-            <w:proofErr w:type="gramStart"/>
-            <w:r>
-              <w:rPr>
-                <w:sz w:val="24"/>
-                <w:szCs w:val="24"/>
-              </w:rPr>
-              <w:t>notary</w:t>
-            </w:r>
-            <w:proofErr w:type="gramEnd"/>
-            <w:r>
-              <w:rPr>
-                <w:sz w:val="24"/>
-                <w:szCs w:val="24"/>
-              </w:rPr>
-              <w:t xml:space="preserve"> </w:t>
-            </w:r>
-            <w:r>
-              <w:rPr>
-                <w:sz w:val="24"/>
-                <w:szCs w:val="24"/>
-              </w:rPr>
-              <w:t>your</w:t>
-            </w:r>
-            <w:r>
-              <w:rPr>
-                <w:sz w:val="24"/>
-                <w:szCs w:val="24"/>
-              </w:rPr>
-              <w:t xml:space="preserve"> driver’s license, passport, or state ID.</w:t>
-            </w:r>
-          </w:p>
-          <w:p>
-            <w:pPr>
-              <w:pStyle w:val="NoSpacing"/>
-              <w:numPr>
-                <w:ilvl w:val="0"/>
-                <w:numId w:val="7"/>
-              </w:numPr>
-              <w:spacing w:line="360" w:lineRule="auto"/>
-              <w:rPr>
-                <w:rFonts w:cs="Arial"/>
-                <w:b/>
-                <w:sz w:val="24"/>
-                <w:szCs w:val="24"/>
-              </w:rPr>
-            </w:pPr>
-            <w:r>
-              <w:rPr>
-                <w:rFonts w:cs="Arial"/>
-                <w:b/>
-                <w:sz w:val="24"/>
-                <w:szCs w:val="24"/>
-              </w:rPr>
-              <w:t>A copier</w:t>
-            </w:r>
-            <w:r>
-              <w:rPr>
-                <w:rFonts w:cs="Arial"/>
-                <w:bCs/>
-                <w:sz w:val="24"/>
-                <w:szCs w:val="24"/>
-              </w:rPr>
-              <w:t xml:space="preserve">. </w:t>
-            </w:r>
-            <w:r>
-              <w:rPr>
-                <w:sz w:val="24"/>
-                <w:szCs w:val="24"/>
-              </w:rPr>
-              <w:t>The notary may make copies</w:t>
-            </w:r>
-            <w:r>
-              <w:rPr>
-                <w:sz w:val="24"/>
-                <w:szCs w:val="24"/>
-              </w:rPr>
-              <w:t xml:space="preserve"> of your forms</w:t>
-            </w:r>
-            <w:r>
-              <w:rPr>
-                <w:sz w:val="24"/>
-                <w:szCs w:val="24"/>
-              </w:rPr>
-              <w:t xml:space="preserve"> for a fee, or you can see if there is a cheaper copier at a library, courthouse, or a print shop.</w:t>
-            </w:r>
-          </w:p>
-          <w:p>
-            <w:pPr>
-              <w:pStyle w:val="NoSpacing"/>
-              <w:numPr>
-                <w:ilvl w:val="0"/>
-                <w:numId w:val="7"/>
-              </w:numPr>
-              <w:spacing w:line="360" w:lineRule="auto"/>
-              <w:rPr>
-                <w:rFonts w:cs="Arial"/>
-                <w:b/>
-                <w:sz w:val="24"/>
-                <w:szCs w:val="24"/>
-              </w:rPr>
-            </w:pPr>
-            <w:r>
-              <w:rPr>
-                <w:rFonts w:cs="Arial"/>
-                <w:b/>
-                <w:sz w:val="24"/>
-                <w:szCs w:val="24"/>
-              </w:rPr>
-              <w:t>Money.</w:t>
-            </w:r>
-            <w:r>
-              <w:rPr>
-                <w:rFonts w:cs="Arial"/>
-                <w:bCs/>
-                <w:sz w:val="24"/>
-                <w:szCs w:val="24"/>
-              </w:rPr>
-              <w:t xml:space="preserve"> You may need to pay for notary, copies of your forms, and postage to mail your forms.</w:t>
             </w:r>
           </w:p>
           <w:p>
@@ -691,78 +400,18 @@
               <w:rPr>
                 <w:rFonts w:cs="Arial"/>
                 <w:b/>
-                <w:sz w:val="16"/>
-                <w:szCs w:val="16"/>
+                <w:sz w:val="24"/>
+                <w:szCs w:val="24"/>
               </w:rPr>
             </w:pPr>
-          </w:p>
-          <w:p>
-            <w:pPr>
-              <w:pStyle w:val="NoSpacing"/>
-              <w:spacing w:after="40" w:line="360" w:lineRule="auto"/>
+            <w:r>
               <w:rPr>
                 <w:rFonts w:cs="Arial"/>
                 <w:b/>
                 <w:sz w:val="24"/>
                 <w:szCs w:val="24"/>
               </w:rPr>
-            </w:pPr>
-            <w:r>
-              <w:rPr>
-                <w:rFonts w:cs="Arial"/>
-                <w:b/>
-                <w:sz w:val="24"/>
-                <w:szCs w:val="24"/>
-              </w:rPr>
-              <w:t xml:space="preserve">What </w:t>
-            </w:r>
-            <w:r>
-              <w:rPr>
-                <w:rFonts w:cs="Arial"/>
-                <w:b/>
-                <w:sz w:val="24"/>
-                <w:szCs w:val="24"/>
-              </w:rPr>
-              <w:t>will I have to do</w:t>
-            </w:r>
-            <w:r>
-              <w:rPr>
-                <w:rFonts w:cs="Arial"/>
-                <w:b/>
-                <w:sz w:val="24"/>
-                <w:szCs w:val="24"/>
-              </w:rPr>
-              <w:t>?</w:t>
-            </w:r>
-          </w:p>
-          <w:p>
-            <w:pPr>
-              <w:pStyle w:val="NoSpacing"/>
-              <w:spacing w:after="40" w:line="360" w:lineRule="auto"/>
-              <w:rPr>
-                <w:rFonts w:cs="Arial"/>
-                <w:b/>
-                <w:sz w:val="24"/>
-                <w:szCs w:val="24"/>
-              </w:rPr>
-            </w:pPr>
-            <w:r>
-              <w:rPr>
-                <w:rFonts w:cs="Arial"/>
-                <w:b/>
-                <w:sz w:val="24"/>
-                <w:szCs w:val="24"/>
-              </w:rPr>
-              <w:t>Get your petition signed and notarized</w:t>
-            </w:r>
-            <w:r>
-              <w:rPr>
-                <w:rFonts w:cs="Arial"/>
-                <w:b/>
-                <w:sz w:val="24"/>
-                <w:szCs w:val="24"/>
-              </w:rPr>
-              <w:t>.</w:t>
+              <w:t>Sign your petition</w:t>
             </w:r>
           </w:p>
           <w:p>
@@ -810,141 +459,23 @@
                 <w:sz w:val="24"/>
                 <w:szCs w:val="24"/>
               </w:rPr>
-              <w:t>Bring your two unsigned petitions to the notary</w:t>
-            </w:r>
-          </w:p>
-          <w:p>
-            <w:pPr>
-              <w:pStyle w:val="NoSpacing"/>
-              <w:numPr>
-                <w:ilvl w:val="0"/>
-                <w:numId w:val="4"/>
-              </w:numPr>
-              <w:spacing w:after="40" w:line="360" w:lineRule="auto"/>
-              <w:ind w:left="360"/>
-              <w:rPr>
-                <w:rFonts w:cs="Arial"/>
-                <w:sz w:val="24"/>
-                <w:szCs w:val="24"/>
-              </w:rPr>
-            </w:pPr>
-            <w:r>
-              <w:rPr>
-                <w:rFonts w:cs="Arial"/>
-                <w:sz w:val="24"/>
-                <w:szCs w:val="24"/>
-              </w:rPr>
-              <w:t>While the notary watches, sign your name at the bottom of the petition.</w:t>
-            </w:r>
-          </w:p>
-          <w:p>
-            <w:pPr>
-              <w:pStyle w:val="NoSpacing"/>
-              <w:numPr>
-                <w:ilvl w:val="0"/>
-                <w:numId w:val="4"/>
-              </w:numPr>
-              <w:spacing w:after="40" w:line="360" w:lineRule="auto"/>
-              <w:ind w:left="360"/>
-              <w:rPr>
-                <w:rFonts w:cs="Arial"/>
-                <w:sz w:val="24"/>
-                <w:szCs w:val="24"/>
-              </w:rPr>
-            </w:pPr>
-            <w:r>
-              <w:rPr>
-                <w:sz w:val="24"/>
-                <w:szCs w:val="24"/>
-              </w:rPr>
-              <w:t>T</w:t>
-            </w:r>
-            <w:r>
-              <w:rPr>
-                <w:sz w:val="24"/>
-                <w:szCs w:val="24"/>
-              </w:rPr>
-              <w:t xml:space="preserve">he notary will complete the bottom section of the </w:t>
-            </w:r>
-            <w:r>
-              <w:rPr>
-                <w:bCs/>
-                <w:sz w:val="24"/>
-                <w:szCs w:val="24"/>
-              </w:rPr>
-              <w:t>Petition</w:t>
-            </w:r>
-            <w:r>
-              <w:rPr>
-                <w:b/>
-                <w:sz w:val="24"/>
-                <w:szCs w:val="24"/>
-              </w:rPr>
-              <w:t xml:space="preserve"> </w:t>
-            </w:r>
-            <w:r>
-              <w:rPr>
-                <w:sz w:val="24"/>
-                <w:szCs w:val="24"/>
-              </w:rPr>
-              <w:t xml:space="preserve">and sign and stamp the </w:t>
-            </w:r>
-            <w:r>
-              <w:rPr>
-                <w:bCs/>
-                <w:sz w:val="24"/>
-                <w:szCs w:val="24"/>
-              </w:rPr>
-              <w:t>Petition</w:t>
-            </w:r>
-            <w:r>
-              <w:rPr>
-                <w:sz w:val="24"/>
-                <w:szCs w:val="24"/>
-              </w:rPr>
-              <w:t>.</w:t>
-            </w:r>
-          </w:p>
-          <w:p>
-            <w:pPr>
-              <w:pStyle w:val="NoSpacing"/>
-              <w:numPr>
-                <w:ilvl w:val="0"/>
-                <w:numId w:val="2"/>
-              </w:numPr>
-              <w:spacing w:after="60" w:line="360" w:lineRule="auto"/>
-              <w:ind w:left="360"/>
-              <w:rPr>
-                <w:rFonts w:cs="Arial"/>
-                <w:sz w:val="24"/>
-                <w:szCs w:val="24"/>
-              </w:rPr>
-            </w:pPr>
-            <w:r>
-              <w:rPr>
-                <w:rFonts w:cs="Arial"/>
-                <w:sz w:val="24"/>
-                <w:szCs w:val="24"/>
-              </w:rPr>
-              <w:t xml:space="preserve">You may need to pay the notary </w:t>
-            </w:r>
-            <w:proofErr w:type="gramStart"/>
-            <w:r>
-              <w:rPr>
-                <w:rFonts w:cs="Arial"/>
-                <w:sz w:val="24"/>
-                <w:szCs w:val="24"/>
-              </w:rPr>
-              <w:t>a fee</w:t>
-            </w:r>
-            <w:proofErr w:type="gramEnd"/>
-            <w:r>
-              <w:rPr>
-                <w:rFonts w:cs="Arial"/>
-                <w:sz w:val="24"/>
-                <w:szCs w:val="24"/>
-              </w:rPr>
-              <w:t xml:space="preserve"> of $1.00 per page</w:t>
+              <w:t>S</w:t>
+            </w:r>
+            <w:r>
+              <w:rPr>
+                <w:rFonts w:cs="Arial"/>
+                <w:sz w:val="24"/>
+                <w:szCs w:val="24"/>
+              </w:rPr>
+              <w:t>ign your name at the bottom of the petition</w:t>
+            </w:r>
+            <w:r>
+              <w:rPr>
+                <w:rFonts w:cs="Arial"/>
+                <w:sz w:val="24"/>
+                <w:szCs w:val="24"/>
+              </w:rPr>
+              <w:t xml:space="preserve"> if you did not already sign it electronically</w:t>
             </w:r>
             <w:r>
               <w:rPr>
@@ -983,7 +514,6 @@
                 <w:sz w:val="24"/>
                 <w:szCs w:val="24"/>
               </w:rPr>
-              <w:lastRenderedPageBreak/>
               <w:t>Make copies</w:t>
             </w:r>
           </w:p>
@@ -1333,6 +863,7 @@
                 <w:sz w:val="24"/>
                 <w:szCs w:val="24"/>
               </w:rPr>
+              <w:lastRenderedPageBreak/>
               <w:t xml:space="preserve">Give a copy of the Petition and Notice to the current guardian and your child’s family members. You may want to send these by certified mail so you can prove they were delivered. To learn more about certified mail, visit </w:t>
             </w:r>
             <w:hyperlink r:id="rId10" w:history="1">

</xml_diff>

<commit_message>
Implemented May 19 2026 feedback
</commit_message>
<xml_diff>
--- a/docassemble/MinorGuardianshipDischarge/data/templates/guardianship_discharge_instructions.docx
+++ b/docassemble/MinorGuardianshipDischarge/data/templates/guardianship_discharge_instructions.docx
@@ -272,7 +272,25 @@
                 <w:sz w:val="24"/>
                 <w:szCs w:val="24"/>
               </w:rPr>
-              <w:t>when you are able to take care of your child and the guardian is no longer needed</w:t>
+              <w:t xml:space="preserve">when you </w:t>
+            </w:r>
+            <w:proofErr w:type="gramStart"/>
+            <w:r>
+              <w:rPr>
+                <w:rFonts w:cs="Arial"/>
+                <w:sz w:val="24"/>
+                <w:szCs w:val="24"/>
+              </w:rPr>
+              <w:t>are able to</w:t>
+            </w:r>
+            <w:proofErr w:type="gramEnd"/>
+            <w:r>
+              <w:rPr>
+                <w:rFonts w:cs="Arial"/>
+                <w:sz w:val="24"/>
+                <w:szCs w:val="24"/>
+              </w:rPr>
+              <w:t xml:space="preserve"> take care of your child and the guardian is no longer needed</w:t>
             </w:r>
             <w:r>
               <w:rPr>
@@ -475,7 +493,25 @@
                 <w:sz w:val="24"/>
                 <w:szCs w:val="24"/>
               </w:rPr>
-              <w:t xml:space="preserve"> if you did not already sign it electronically</w:t>
+              <w:t xml:space="preserve"> if you did </w:t>
+            </w:r>
+            <w:proofErr w:type="gramStart"/>
+            <w:r>
+              <w:rPr>
+                <w:rFonts w:cs="Arial"/>
+                <w:sz w:val="24"/>
+                <w:szCs w:val="24"/>
+              </w:rPr>
+              <w:t>not already</w:t>
+            </w:r>
+            <w:proofErr w:type="gramEnd"/>
+            <w:r>
+              <w:rPr>
+                <w:rFonts w:cs="Arial"/>
+                <w:sz w:val="24"/>
+                <w:szCs w:val="24"/>
+              </w:rPr>
+              <w:t xml:space="preserve"> sign it electronically</w:t>
             </w:r>
             <w:r>
               <w:rPr>
@@ -1054,10 +1090,16 @@
     </w:p>
     <w:p/>
     <w:sectPr>
-      <w:footerReference w:type="default" r:id="rId11"/>
+      <w:headerReference w:type="even" r:id="rId11"/>
+      <w:headerReference w:type="default" r:id="rId12"/>
+      <w:footerReference w:type="even" r:id="rId13"/>
+      <w:footerReference w:type="default" r:id="rId14"/>
+      <w:headerReference w:type="first" r:id="rId15"/>
+      <w:footerReference w:type="first" r:id="rId16"/>
       <w:pgSz w:w="12240" w:h="15840"/>
       <w:pgMar w:top="720" w:right="720" w:bottom="720" w:left="720" w:header="720" w:footer="720" w:gutter="0"/>
       <w:cols w:space="720"/>
+      <w:titlePg/>
       <w:docGrid w:linePitch="360"/>
     </w:sectPr>
   </w:body>
@@ -1088,22 +1130,32 @@
   <w:p>
     <w:pPr>
       <w:pStyle w:val="Footer"/>
+    </w:pPr>
+  </w:p>
+</w:ftr>
+</file>
+
+<file path=word/footer2.xml><?xml version="1.0" encoding="utf-8"?>
+<w:ftr xmlns:wpc="http://schemas.microsoft.com/office/word/2010/wordprocessingCanvas" xmlns:cx="http://schemas.microsoft.com/office/drawing/2014/chartex" xmlns:cx1="http://schemas.microsoft.com/office/drawing/2015/9/8/chartex" xmlns:cx2="http://schemas.microsoft.com/office/drawing/2015/10/21/chartex" xmlns:cx3="http://schemas.microsoft.com/office/drawing/2016/5/9/chartex" xmlns:cx4="http://schemas.microsoft.com/office/drawing/2016/5/10/chartex" xmlns:cx5="http://schemas.microsoft.com/office/drawing/2016/5/11/chartex" xmlns:cx6="http://schemas.microsoft.com/office/drawing/2016/5/12/chartex" xmlns:cx7="http://schemas.microsoft.com/office/drawing/2016/5/13/chartex" xmlns:cx8="http://schemas.microsoft.com/office/drawing/2016/5/14/chartex" xmlns:mc="http://schemas.openxmlformats.org/markup-compatibility/2006" xmlns:aink="http://schemas.microsoft.com/office/drawing/2016/ink" xmlns:am3d="http://schemas.microsoft.com/office/drawing/2017/model3d" xmlns:o="urn:schemas-microsoft-com:office:office" xmlns:oel="http://schemas.microsoft.com/office/2019/extlst" xmlns:r="http://schemas.openxmlformats.org/officeDocument/2006/relationships" xmlns:m="http://schemas.openxmlformats.org/officeDocument/2006/math" xmlns:v="urn:schemas-microsoft-com:vml" xmlns:wp14="http://schemas.microsoft.com/office/word/2010/wordprocessingDrawing" xmlns:wp="http://schemas.openxmlformats.org/drawingml/2006/wordprocessingDrawing" xmlns:w10="urn:schemas-microsoft-com:office:word" xmlns:w="http://schemas.openxmlformats.org/wordprocessingml/2006/main" xmlns:w14="http://schemas.microsoft.com/office/word/2010/wordml" xmlns:w15="http://schemas.microsoft.com/office/word/2012/wordml" xmlns:w16cex="http://schemas.microsoft.com/office/word/2018/wordml/cex" xmlns:w16cid="http://schemas.microsoft.com/office/word/2016/wordml/cid" xmlns:w16="http://schemas.microsoft.com/office/word/2018/wordml" xmlns:w16du="http://schemas.microsoft.com/office/word/2023/wordml/word16du" xmlns:w16sdtdh="http://schemas.microsoft.com/office/word/2020/wordml/sdtdatahash" xmlns:w16sdtfl="http://schemas.microsoft.com/office/word/2024/wordml/sdtformatlock" xmlns:w16se="http://schemas.microsoft.com/office/word/2015/wordml/symex" xmlns:wpg="http://schemas.microsoft.com/office/word/2010/wordprocessingGroup" xmlns:wpi="http://schemas.microsoft.com/office/word/2010/wordprocessingInk" xmlns:wne="http://schemas.microsoft.com/office/word/2006/wordml" xmlns:wps="http://schemas.microsoft.com/office/word/2010/wordprocessingShape" mc:Ignorable="w14 w15 w16se w16cid w16 w16cex w16sdtdh w16sdtfl w16du wp14">
+  <w:p>
+    <w:pPr>
+      <w:pStyle w:val="Footer"/>
       <w:jc w:val="center"/>
       <w:rPr>
-        <w:rFonts w:ascii="Muli" w:hAnsi="Muli" w:cs="Arial"/>
+        <w:rFonts w:ascii="Arial" w:hAnsi="Arial" w:cs="Arial"/>
         <w:b/>
       </w:rPr>
     </w:pPr>
     <w:r>
       <w:rPr>
-        <w:rFonts w:ascii="Muli" w:hAnsi="Muli" w:cs="Arial"/>
+        <w:rFonts w:ascii="Arial" w:hAnsi="Arial" w:cs="Arial"/>
         <w:b/>
       </w:rPr>
       <w:t>Do not send these instructions to the court</w:t>
     </w:r>
     <w:r>
       <w:rPr>
-        <w:rFonts w:ascii="Muli" w:hAnsi="Muli" w:cs="Arial"/>
+        <w:rFonts w:ascii="Arial" w:hAnsi="Arial" w:cs="Arial"/>
         <w:b/>
       </w:rPr>
       <w:t>.</w:t>
@@ -1114,15 +1166,12 @@
       <w:pStyle w:val="Footer"/>
       <w:jc w:val="center"/>
       <w:rPr>
-        <w:rFonts w:ascii="Muli" w:hAnsi="Muli" w:cs="Arial"/>
-        <w:b/>
-        <w:sz w:val="22"/>
-        <w:szCs w:val="22"/>
+        <w:rFonts w:ascii="Arial" w:hAnsi="Arial" w:cs="Arial"/>
       </w:rPr>
     </w:pPr>
     <w:r>
       <w:rPr>
-        <w:rFonts w:ascii="Muli" w:hAnsi="Muli"/>
+        <w:rFonts w:ascii="Arial" w:hAnsi="Arial" w:cs="Arial"/>
         <w:sz w:val="22"/>
         <w:szCs w:val="22"/>
       </w:rPr>
@@ -1132,7 +1181,7 @@
       <w:r>
         <w:rPr>
           <w:rStyle w:val="Hyperlink"/>
-          <w:rFonts w:ascii="Muli" w:hAnsi="Muli" w:cs="Arial"/>
+          <w:rFonts w:ascii="Arial" w:hAnsi="Arial" w:cs="Arial"/>
           <w:b/>
           <w:sz w:val="22"/>
           <w:szCs w:val="22"/>
@@ -1140,6 +1189,87 @@
         <w:t>www.illinoislegalaid.org</w:t>
       </w:r>
     </w:hyperlink>
+  </w:p>
+  <w:p>
+    <w:pPr>
+      <w:pStyle w:val="Footer"/>
+      <w:jc w:val="center"/>
+      <w:rPr>
+        <w:rFonts w:ascii="Arial" w:hAnsi="Arial" w:cs="Arial"/>
+      </w:rPr>
+    </w:pPr>
+    <w:r>
+      <w:rPr>
+        <w:rFonts w:ascii="Arial" w:hAnsi="Arial" w:cs="Arial"/>
+      </w:rPr>
+      <w:t>Page 2 of 2</w:t>
+    </w:r>
+  </w:p>
+</w:ftr>
+</file>
+
+<file path=word/footer3.xml><?xml version="1.0" encoding="utf-8"?>
+<w:ftr xmlns:wpc="http://schemas.microsoft.com/office/word/2010/wordprocessingCanvas" xmlns:cx="http://schemas.microsoft.com/office/drawing/2014/chartex" xmlns:cx1="http://schemas.microsoft.com/office/drawing/2015/9/8/chartex" xmlns:cx2="http://schemas.microsoft.com/office/drawing/2015/10/21/chartex" xmlns:cx3="http://schemas.microsoft.com/office/drawing/2016/5/9/chartex" xmlns:cx4="http://schemas.microsoft.com/office/drawing/2016/5/10/chartex" xmlns:cx5="http://schemas.microsoft.com/office/drawing/2016/5/11/chartex" xmlns:cx6="http://schemas.microsoft.com/office/drawing/2016/5/12/chartex" xmlns:cx7="http://schemas.microsoft.com/office/drawing/2016/5/13/chartex" xmlns:cx8="http://schemas.microsoft.com/office/drawing/2016/5/14/chartex" xmlns:mc="http://schemas.openxmlformats.org/markup-compatibility/2006" xmlns:aink="http://schemas.microsoft.com/office/drawing/2016/ink" xmlns:am3d="http://schemas.microsoft.com/office/drawing/2017/model3d" xmlns:o="urn:schemas-microsoft-com:office:office" xmlns:oel="http://schemas.microsoft.com/office/2019/extlst" xmlns:r="http://schemas.openxmlformats.org/officeDocument/2006/relationships" xmlns:m="http://schemas.openxmlformats.org/officeDocument/2006/math" xmlns:v="urn:schemas-microsoft-com:vml" xmlns:wp14="http://schemas.microsoft.com/office/word/2010/wordprocessingDrawing" xmlns:wp="http://schemas.openxmlformats.org/drawingml/2006/wordprocessingDrawing" xmlns:w10="urn:schemas-microsoft-com:office:word" xmlns:w="http://schemas.openxmlformats.org/wordprocessingml/2006/main" xmlns:w14="http://schemas.microsoft.com/office/word/2010/wordml" xmlns:w15="http://schemas.microsoft.com/office/word/2012/wordml" xmlns:w16cex="http://schemas.microsoft.com/office/word/2018/wordml/cex" xmlns:w16cid="http://schemas.microsoft.com/office/word/2016/wordml/cid" xmlns:w16="http://schemas.microsoft.com/office/word/2018/wordml" xmlns:w16du="http://schemas.microsoft.com/office/word/2023/wordml/word16du" xmlns:w16sdtdh="http://schemas.microsoft.com/office/word/2020/wordml/sdtdatahash" xmlns:w16sdtfl="http://schemas.microsoft.com/office/word/2024/wordml/sdtformatlock" xmlns:w16se="http://schemas.microsoft.com/office/word/2015/wordml/symex" xmlns:wpg="http://schemas.microsoft.com/office/word/2010/wordprocessingGroup" xmlns:wpi="http://schemas.microsoft.com/office/word/2010/wordprocessingInk" xmlns:wne="http://schemas.microsoft.com/office/word/2006/wordml" xmlns:wps="http://schemas.microsoft.com/office/word/2010/wordprocessingShape" mc:Ignorable="w14 w15 w16se w16cid w16 w16cex w16sdtdh w16sdtfl w16du wp14">
+  <w:p>
+    <w:pPr>
+      <w:pStyle w:val="Footer"/>
+      <w:jc w:val="center"/>
+      <w:rPr>
+        <w:rFonts w:ascii="Arial" w:hAnsi="Arial" w:cs="Arial"/>
+        <w:b/>
+      </w:rPr>
+    </w:pPr>
+    <w:r>
+      <w:rPr>
+        <w:rFonts w:ascii="Arial" w:hAnsi="Arial" w:cs="Arial"/>
+        <w:b/>
+      </w:rPr>
+      <w:t>Do not send these instructions to the court.</w:t>
+    </w:r>
+  </w:p>
+  <w:p>
+    <w:pPr>
+      <w:pStyle w:val="Footer"/>
+      <w:jc w:val="center"/>
+      <w:rPr>
+        <w:rFonts w:ascii="Arial" w:hAnsi="Arial" w:cs="Arial"/>
+      </w:rPr>
+    </w:pPr>
+    <w:r>
+      <w:rPr>
+        <w:rFonts w:ascii="Arial" w:hAnsi="Arial" w:cs="Arial"/>
+        <w:sz w:val="22"/>
+        <w:szCs w:val="22"/>
+      </w:rPr>
+      <w:t xml:space="preserve">Illinois Legal Aid Online   </w:t>
+    </w:r>
+    <w:hyperlink r:id="rId1" w:history="1">
+      <w:r>
+        <w:rPr>
+          <w:rStyle w:val="Hyperlink"/>
+          <w:rFonts w:ascii="Arial" w:hAnsi="Arial" w:cs="Arial"/>
+          <w:b/>
+          <w:sz w:val="22"/>
+          <w:szCs w:val="22"/>
+        </w:rPr>
+        <w:t>www.illinoislegalaid.org</w:t>
+      </w:r>
+    </w:hyperlink>
+  </w:p>
+  <w:p>
+    <w:pPr>
+      <w:pStyle w:val="Footer"/>
+      <w:jc w:val="center"/>
+      <w:rPr>
+        <w:rFonts w:ascii="Arial" w:hAnsi="Arial" w:cs="Arial"/>
+      </w:rPr>
+    </w:pPr>
+    <w:r>
+      <w:rPr>
+        <w:rFonts w:ascii="Arial" w:hAnsi="Arial" w:cs="Arial"/>
+      </w:rPr>
+      <w:t>Page 1 of 2</w:t>
+    </w:r>
   </w:p>
 </w:ftr>
 </file>
@@ -1161,6 +1291,36 @@
     </w:p>
   </w:footnote>
 </w:footnotes>
+</file>
+
+<file path=word/header1.xml><?xml version="1.0" encoding="utf-8"?>
+<w:hdr xmlns:wpc="http://schemas.microsoft.com/office/word/2010/wordprocessingCanvas" xmlns:cx="http://schemas.microsoft.com/office/drawing/2014/chartex" xmlns:cx1="http://schemas.microsoft.com/office/drawing/2015/9/8/chartex" xmlns:cx2="http://schemas.microsoft.com/office/drawing/2015/10/21/chartex" xmlns:cx3="http://schemas.microsoft.com/office/drawing/2016/5/9/chartex" xmlns:cx4="http://schemas.microsoft.com/office/drawing/2016/5/10/chartex" xmlns:cx5="http://schemas.microsoft.com/office/drawing/2016/5/11/chartex" xmlns:cx6="http://schemas.microsoft.com/office/drawing/2016/5/12/chartex" xmlns:cx7="http://schemas.microsoft.com/office/drawing/2016/5/13/chartex" xmlns:cx8="http://schemas.microsoft.com/office/drawing/2016/5/14/chartex" xmlns:mc="http://schemas.openxmlformats.org/markup-compatibility/2006" xmlns:aink="http://schemas.microsoft.com/office/drawing/2016/ink" xmlns:am3d="http://schemas.microsoft.com/office/drawing/2017/model3d" xmlns:o="urn:schemas-microsoft-com:office:office" xmlns:oel="http://schemas.microsoft.com/office/2019/extlst" xmlns:r="http://schemas.openxmlformats.org/officeDocument/2006/relationships" xmlns:m="http://schemas.openxmlformats.org/officeDocument/2006/math" xmlns:v="urn:schemas-microsoft-com:vml" xmlns:wp14="http://schemas.microsoft.com/office/word/2010/wordprocessingDrawing" xmlns:wp="http://schemas.openxmlformats.org/drawingml/2006/wordprocessingDrawing" xmlns:w10="urn:schemas-microsoft-com:office:word" xmlns:w="http://schemas.openxmlformats.org/wordprocessingml/2006/main" xmlns:w14="http://schemas.microsoft.com/office/word/2010/wordml" xmlns:w15="http://schemas.microsoft.com/office/word/2012/wordml" xmlns:w16cex="http://schemas.microsoft.com/office/word/2018/wordml/cex" xmlns:w16cid="http://schemas.microsoft.com/office/word/2016/wordml/cid" xmlns:w16="http://schemas.microsoft.com/office/word/2018/wordml" xmlns:w16du="http://schemas.microsoft.com/office/word/2023/wordml/word16du" xmlns:w16sdtdh="http://schemas.microsoft.com/office/word/2020/wordml/sdtdatahash" xmlns:w16sdtfl="http://schemas.microsoft.com/office/word/2024/wordml/sdtformatlock" xmlns:w16se="http://schemas.microsoft.com/office/word/2015/wordml/symex" xmlns:wpg="http://schemas.microsoft.com/office/word/2010/wordprocessingGroup" xmlns:wpi="http://schemas.microsoft.com/office/word/2010/wordprocessingInk" xmlns:wne="http://schemas.microsoft.com/office/word/2006/wordml" xmlns:wps="http://schemas.microsoft.com/office/word/2010/wordprocessingShape" mc:Ignorable="w14 w15 w16se w16cid w16 w16cex w16sdtdh w16sdtfl w16du wp14">
+  <w:p>
+    <w:pPr>
+      <w:pStyle w:val="Header"/>
+    </w:pPr>
+  </w:p>
+</w:hdr>
+</file>
+
+<file path=word/header2.xml><?xml version="1.0" encoding="utf-8"?>
+<w:hdr xmlns:wpc="http://schemas.microsoft.com/office/word/2010/wordprocessingCanvas" xmlns:cx="http://schemas.microsoft.com/office/drawing/2014/chartex" xmlns:cx1="http://schemas.microsoft.com/office/drawing/2015/9/8/chartex" xmlns:cx2="http://schemas.microsoft.com/office/drawing/2015/10/21/chartex" xmlns:cx3="http://schemas.microsoft.com/office/drawing/2016/5/9/chartex" xmlns:cx4="http://schemas.microsoft.com/office/drawing/2016/5/10/chartex" xmlns:cx5="http://schemas.microsoft.com/office/drawing/2016/5/11/chartex" xmlns:cx6="http://schemas.microsoft.com/office/drawing/2016/5/12/chartex" xmlns:cx7="http://schemas.microsoft.com/office/drawing/2016/5/13/chartex" xmlns:cx8="http://schemas.microsoft.com/office/drawing/2016/5/14/chartex" xmlns:mc="http://schemas.openxmlformats.org/markup-compatibility/2006" xmlns:aink="http://schemas.microsoft.com/office/drawing/2016/ink" xmlns:am3d="http://schemas.microsoft.com/office/drawing/2017/model3d" xmlns:o="urn:schemas-microsoft-com:office:office" xmlns:oel="http://schemas.microsoft.com/office/2019/extlst" xmlns:r="http://schemas.openxmlformats.org/officeDocument/2006/relationships" xmlns:m="http://schemas.openxmlformats.org/officeDocument/2006/math" xmlns:v="urn:schemas-microsoft-com:vml" xmlns:wp14="http://schemas.microsoft.com/office/word/2010/wordprocessingDrawing" xmlns:wp="http://schemas.openxmlformats.org/drawingml/2006/wordprocessingDrawing" xmlns:w10="urn:schemas-microsoft-com:office:word" xmlns:w="http://schemas.openxmlformats.org/wordprocessingml/2006/main" xmlns:w14="http://schemas.microsoft.com/office/word/2010/wordml" xmlns:w15="http://schemas.microsoft.com/office/word/2012/wordml" xmlns:w16cex="http://schemas.microsoft.com/office/word/2018/wordml/cex" xmlns:w16cid="http://schemas.microsoft.com/office/word/2016/wordml/cid" xmlns:w16="http://schemas.microsoft.com/office/word/2018/wordml" xmlns:w16du="http://schemas.microsoft.com/office/word/2023/wordml/word16du" xmlns:w16sdtdh="http://schemas.microsoft.com/office/word/2020/wordml/sdtdatahash" xmlns:w16sdtfl="http://schemas.microsoft.com/office/word/2024/wordml/sdtformatlock" xmlns:w16se="http://schemas.microsoft.com/office/word/2015/wordml/symex" xmlns:wpg="http://schemas.microsoft.com/office/word/2010/wordprocessingGroup" xmlns:wpi="http://schemas.microsoft.com/office/word/2010/wordprocessingInk" xmlns:wne="http://schemas.microsoft.com/office/word/2006/wordml" xmlns:wps="http://schemas.microsoft.com/office/word/2010/wordprocessingShape" mc:Ignorable="w14 w15 w16se w16cid w16 w16cex w16sdtdh w16sdtfl w16du wp14">
+  <w:p>
+    <w:pPr>
+      <w:pStyle w:val="Header"/>
+    </w:pPr>
+  </w:p>
+</w:hdr>
+</file>
+
+<file path=word/header3.xml><?xml version="1.0" encoding="utf-8"?>
+<w:hdr xmlns:wpc="http://schemas.microsoft.com/office/word/2010/wordprocessingCanvas" xmlns:cx="http://schemas.microsoft.com/office/drawing/2014/chartex" xmlns:cx1="http://schemas.microsoft.com/office/drawing/2015/9/8/chartex" xmlns:cx2="http://schemas.microsoft.com/office/drawing/2015/10/21/chartex" xmlns:cx3="http://schemas.microsoft.com/office/drawing/2016/5/9/chartex" xmlns:cx4="http://schemas.microsoft.com/office/drawing/2016/5/10/chartex" xmlns:cx5="http://schemas.microsoft.com/office/drawing/2016/5/11/chartex" xmlns:cx6="http://schemas.microsoft.com/office/drawing/2016/5/12/chartex" xmlns:cx7="http://schemas.microsoft.com/office/drawing/2016/5/13/chartex" xmlns:cx8="http://schemas.microsoft.com/office/drawing/2016/5/14/chartex" xmlns:mc="http://schemas.openxmlformats.org/markup-compatibility/2006" xmlns:aink="http://schemas.microsoft.com/office/drawing/2016/ink" xmlns:am3d="http://schemas.microsoft.com/office/drawing/2017/model3d" xmlns:o="urn:schemas-microsoft-com:office:office" xmlns:oel="http://schemas.microsoft.com/office/2019/extlst" xmlns:r="http://schemas.openxmlformats.org/officeDocument/2006/relationships" xmlns:m="http://schemas.openxmlformats.org/officeDocument/2006/math" xmlns:v="urn:schemas-microsoft-com:vml" xmlns:wp14="http://schemas.microsoft.com/office/word/2010/wordprocessingDrawing" xmlns:wp="http://schemas.openxmlformats.org/drawingml/2006/wordprocessingDrawing" xmlns:w10="urn:schemas-microsoft-com:office:word" xmlns:w="http://schemas.openxmlformats.org/wordprocessingml/2006/main" xmlns:w14="http://schemas.microsoft.com/office/word/2010/wordml" xmlns:w15="http://schemas.microsoft.com/office/word/2012/wordml" xmlns:w16cex="http://schemas.microsoft.com/office/word/2018/wordml/cex" xmlns:w16cid="http://schemas.microsoft.com/office/word/2016/wordml/cid" xmlns:w16="http://schemas.microsoft.com/office/word/2018/wordml" xmlns:w16du="http://schemas.microsoft.com/office/word/2023/wordml/word16du" xmlns:w16sdtdh="http://schemas.microsoft.com/office/word/2020/wordml/sdtdatahash" xmlns:w16sdtfl="http://schemas.microsoft.com/office/word/2024/wordml/sdtformatlock" xmlns:w16se="http://schemas.microsoft.com/office/word/2015/wordml/symex" xmlns:wpg="http://schemas.microsoft.com/office/word/2010/wordprocessingGroup" xmlns:wpi="http://schemas.microsoft.com/office/word/2010/wordprocessingInk" xmlns:wne="http://schemas.microsoft.com/office/word/2006/wordml" xmlns:wps="http://schemas.microsoft.com/office/word/2010/wordprocessingShape" mc:Ignorable="w14 w15 w16se w16cid w16 w16cex w16sdtdh w16sdtfl w16du wp14">
+  <w:p>
+    <w:pPr>
+      <w:pStyle w:val="Header"/>
+    </w:pPr>
+  </w:p>
+</w:hdr>
 </file>
 
 <file path=word/numbering.xml><?xml version="1.0" encoding="utf-8"?>

</xml_diff>